<commit_message>
Level One 2.3, Start here 1.1, model guide 1.4 for the new Claude app; crossed-arms mascot in README
</commit_message>
<xml_diff>
--- a/source/de/2-level-one.docx
+++ b/source/de/2-level-one.docx
@@ -135,7 +135,7 @@
           <w:sz w:val="20"/>
           <w:szCs w:val="20"/>
         </w:rPr>
-        <w:t xml:space="preserve">Version 2.2 — September 2026</w:t>
+        <w:t xml:space="preserve">Version 2.3 — September 2026</w:t>
       </w:r>
     </w:p>
     <w:p>
@@ -459,7 +459,7 @@
               <w:spacing w:after="100" w:line="262"/>
             </w:pPr>
             <w:r>
-              <w:t xml:space="preserve">Alles hier gibt den Stand von Claude im August 2026 wieder: die Modellfamilien Opus, Sonnet, Haiku und Fable, die Desktop-App Cowork und die gemeinsame Startseite, die Chat, Cowork und Ihre Projects in einer Seitenleiste vereint. Anthropic liefert Updates sehr schnell aus — oft in Tagen, nicht in Monaten. Ein Bildschirm, ein Menüname oder eine Modellnummer kann sich also schon geändert haben. Wenn das, was Sie sehen, nicht zur Seite passt, vertrauen Sie der App und claude.com. Die Ideen und Gewohnheiten hier gelten auch dann, wenn die Schaltflächen wandern.</w:t>
+              <w:t xml:space="preserve">Alles hier gibt den Stand der Claude-App vom 29. September 2026 wieder: die Modelle Opus 5.5, Sonnet 5.5, Haiku 4.5 und Fable 5.1 sowie die neue gemeinsame App, in der Chat und Cowork ein Eingabefeld teilen. Anthropic liefert Updates sehr schnell aus — oft in Tagen, nicht in Monaten. Ein Bildschirm, ein Menüname oder eine Modellnummer kann sich also schon geändert haben. Wenn das, was Sie sehen, nicht zur Seite passt, vertrauen Sie der App und claude.com. Die Ideen und Gewohnheiten hier gelten auch dann, wenn die Schaltflächen wandern.</w:t>
             </w:r>
           </w:p>
         </w:tc>
@@ -506,7 +506,7 @@
                 <w:sz w:val="22"/>
                 <w:szCs w:val="22"/>
               </w:rPr>
-              <w:t xml:space="preserve">Chat und Cowork werden eine App</w:t>
+              <w:t xml:space="preserve">Chat und Cowork sind jetzt eine App</w:t>
             </w:r>
           </w:p>
           <w:p>
@@ -516,7 +516,7 @@
               <w:spacing w:after="60" w:line="262"/>
             </w:pPr>
             <w:r>
-              <w:t xml:space="preserve">Seit Ende September 2026 führt Anthropic Chat und Cowork zu einer einzigen Claude-App zusammen, zuerst bei Pro und Max. Wo dieser Leitfaden Cowork sagt, sehen Sie vielleicht einfach Claude. Die Ideen und Gewohnheiten bleiben gleich.</w:t>
+              <w:t xml:space="preserve">Seit Ende September 2026 teilen Chat und Cowork ein Eingabefeld, mit einem Umschalter Chat | Cowork darunter (zuerst bei Pro und Max, andere Abos folgen). Diese Ausgabe ist für diese neue App geschrieben.</w:t>
             </w:r>
           </w:p>
         </w:tc>
@@ -636,7 +636,7 @@
                 <w:sz w:val="22"/>
                 <w:szCs w:val="22"/>
               </w:rPr>
-              <w:t xml:space="preserve">Was ist neu in Version 2.2</w:t>
+              <w:t xml:space="preserve">Was ist neu in Version 2.3</w:t>
             </w:r>
           </w:p>
           <w:p>
@@ -647,7 +647,7 @@
               <w:spacing w:after="100" w:line="262"/>
             </w:pPr>
             <w:r>
-              <w:t xml:space="preserve">Neu: eine kurze Erklärung jedes Fachworts dort, wo es zum ersten Mal vorkommt; ein nach Themen gegliedertes Glossar; ein Hinweis, welches Abo Sie brauchen. Aktualisiert: Persönliche Faustregeln sind jetzt als Erfahrung gekennzeichnet, nicht als Tatsache.</w:t>
+              <w:t xml:space="preserve">Neu geschrieben für die neue Claude-App, geprüft am 29. September 2026: Chat und Cowork in einem Eingabefeld, Web search im +-Menü, Connectors unter Customize, Scheduled und Devices statt Dispatch. Aktuelle Modelle: Opus 5.5, Sonnet 5.5, Haiku 4.5, Fable 5.1.</w:t>
             </w:r>
           </w:p>
         </w:tc>
@@ -1378,7 +1378,7 @@
         <w:spacing w:after="100" w:line="262"/>
       </w:pPr>
       <w:r>
-        <w:t xml:space="preserve">Claude klingt bei falschen Antworten genauso sicher wie bei richtigen. Lassen Sie Web Search eingeschaltet und bitten Sie Claude, sich selbst zu prüfen: </w:t>
+        <w:t xml:space="preserve">Claude klingt bei falschen Antworten genauso sicher wie bei richtigen. Lassen Sie Web search eingeschaltet (ein Häkchen im +-Menü) und bitten Sie Claude, sich selbst zu prüfen: </w:t>
       </w:r>
       <w:r>
         <w:rPr>
@@ -1409,7 +1409,7 @@
         <w:spacing w:after="100" w:line="262"/>
       </w:pPr>
       <w:r>
-        <w:t xml:space="preserve">Ein Project ist ein Ordner mit Chats, die Anweisungen, Dateien und Gedächtnis teilen. So legen Sie eines an, das Zeit spart, statt zur Rumpelkammer zu werden. Seit Mitte 2026 liegen Ihre Projects in der linken Seitenleiste der gemeinsamen Startseite, geteilt zwischen Chat und Cowork. Heften Sie die an, die Sie nutzen, damit Sie sie schnell finden.</w:t>
+        <w:t xml:space="preserve">Ein Project ist ein Ordner mit Chats, die Anweisungen, Dateien und Gedächtnis teilen. So legen Sie eines an, das Zeit spart, statt zur Rumpelkammer zu werden. Ihre Projects finden Sie unter Projects in der linken Seitenleiste, geteilt zwischen Chat und Cowork. Heften Sie die an, die Sie nutzen, damit Sie sie schnell finden.</w:t>
       </w:r>
     </w:p>
     <w:p>
@@ -1930,7 +1930,7 @@
               <w:spacing w:after="100" w:line="262"/>
             </w:pPr>
             <w:r>
-              <w:t xml:space="preserve">Seit Mitte 2026 hat Cowork im +-Menü der Desktop-App die Option „Record a skill“. Statt die Schritte aufzuschreiben, nehmen Sie Ihren Bildschirm auf und erklären die Aufgabe einmal laut, während Sie sie erledigen. Claude macht aus der Vorführung den Skill. Das ist der bequemste Weg für eine Aufgabe, die sich leichter zeigen als beschreiben lässt — besonders für Browser-Aufgaben ohne Connector. Nehmen Sie keine Passwörter oder privaten Daten auf. Verfügbar mit Pro, Max und Team.</w:t>
+              <w:t xml:space="preserve">Cowork zeigt im +-Menü eventuell die Option „Record a skill“ (falls Sie sie sehen). Statt die Schritte aufzuschreiben, nehmen Sie Ihren Bildschirm auf und erklären die Aufgabe einmal laut, während Sie sie erledigen. Claude macht aus der Vorführung den Skill. Das ist der bequemste Weg für eine Aufgabe, die sich leichter zeigen als beschreiben lässt — besonders für Browser-Aufgaben ohne Connector. Nehmen Sie keine Passwörter oder privaten Daten auf.</w:t>
             </w:r>
           </w:p>
         </w:tc>
@@ -2006,7 +2006,7 @@
         <w:t xml:space="preserve">MCP</w:t>
       </w:r>
       <w:r>
-        <w:t xml:space="preserve"> (Model Context Protocol). Sie finden und fügen sie in den Connectors-Einstellungen hinzu (das „+“ in einem Chat oder Settings, Connectors). Es gibt drei Arten, und der Unterschied ist für das Vertrauen wichtig:</w:t>
+        <w:t xml:space="preserve"> (Model Context Protocol). Sie finden und fügen sie über das +-Menü → Connectors hinzu oder über Customize → Connectors in der linken Seitenleiste. Es gibt drei Arten, und der Unterschied ist für das Vertrauen wichtig:</w:t>
       </w:r>
     </w:p>
     <w:p>
@@ -2616,7 +2616,7 @@
         <w:t xml:space="preserve">Hintergrund- und geplante Aufgaben. </w:t>
       </w:r>
       <w:r>
-        <w:t xml:space="preserve">Arbeit, die weiterläuft, ohne dass Sie zusehen — sogar Dispatch-Aufgaben von Ihrem Handy.</w:t>
+        <w:t xml:space="preserve">Arbeit, die weiterläuft, ohne dass Sie zusehen (Scheduled in der linken Seitenleiste). Sie können sogar eine Cowork-Aufgabe vom Handy starten und wählen, welcher PC sie ausführt (+-Menü → Devices).</w:t>
       </w:r>
     </w:p>
     <w:p>
@@ -3985,7 +3985,7 @@
         <w:t xml:space="preserve">Planen Sie sie </w:t>
       </w:r>
       <w:r>
-        <w:t xml:space="preserve">für 07:00 Uhr an Werktagen ein (Ihr Rechner oder ein ständig laufender Rechner muss eingeschaltet sein).</w:t>
+        <w:t xml:space="preserve">für 07:00 Uhr an Werktagen ein, über Scheduled in der linken Seitenleiste oder mit /schedule (Ihr Rechner oder ein ständig laufender Rechner muss eingeschaltet sein).</w:t>
       </w:r>
     </w:p>
     <w:p>

</xml_diff>